<commit_message>
Add exam reflection doc and update team solution
Co-Authored-By: Claude Sonnet 4.6 <noreply@anthropic.com>
</commit_message>
<xml_diff>
--- a/ISM6255 TeamSolution.docx
+++ b/ISM6255 TeamSolution.docx
@@ -61,7 +61,15 @@
         <w:t xml:space="preserve"> or 4</w:t>
       </w:r>
       <w:r>
-        <w:t xml:space="preserve"> at the discretion of the instructor) in order to complete a comprehensive review of </w:t>
+        <w:t xml:space="preserve"> at the discretion of the instructor) </w:t>
+      </w:r>
+      <w:proofErr w:type="gramStart"/>
+      <w:r>
+        <w:t>in order to</w:t>
+      </w:r>
+      <w:proofErr w:type="gramEnd"/>
+      <w:r>
+        <w:t xml:space="preserve"> complete a comprehensive review of </w:t>
       </w:r>
       <w:r>
         <w:rPr>
@@ -189,33 +197,8 @@
     <w:p>
       <w:r>
         <w:lastRenderedPageBreak/>
-        <w:t xml:space="preserve">Here’s your </w:t>
-      </w:r>
-      <w:r>
-        <w:rPr>
-          <w:b/>
-          <w:bCs/>
-        </w:rPr>
-        <w:t>fully rewritten, polished proposal</w:t>
-      </w:r>
-      <w:r>
-        <w:t xml:space="preserve"> with the </w:t>
-      </w:r>
-      <w:r>
-        <w:rPr>
-          <w:b/>
-          <w:bCs/>
-        </w:rPr>
-        <w:t>Architecture Diagram section added</w:t>
-      </w:r>
-      <w:r>
-        <w:t xml:space="preserve"> and everything integrated cleanly. This is now at a level where it reads like a real product proposal.</w:t>
-      </w:r>
-    </w:p>
-    <w:p>
-      <w:r>
         <w:pict w14:anchorId="031B810C">
-          <v:rect id="_x0000_i1135" style="width:0;height:1.5pt" o:hralign="center" o:hrstd="t" o:hr="t" fillcolor="#a0a0a0" stroked="f"/>
+          <v:rect id="_x0000_i1025" style="width:0;height:1.5pt" o:hralign="center" o:hrstd="t" o:hr="t" fillcolor="#a0a0a0" stroked="f"/>
         </w:pict>
       </w:r>
     </w:p>
@@ -266,19 +249,36 @@
     </w:p>
     <w:p>
       <w:r>
-        <w:t>Another contributing issue is how data is structured behind the scenes. Many reporting systems rely on wide, unoptimized tables or inconsistent schemas, which slow down performance and create inconsistencies across teams. By properly dimensionalizing the data—using fact and dimension tables—the system improves query performance, simplifies logic, and ensures consistent metric definitions. This becomes critical as the platform scales.</w:t>
+        <w:t xml:space="preserve">Another contributing issue is how data is structured behind the scenes. Many reporting systems rely on wide, unoptimized tables or inconsistent schemas, which slow down performance and create inconsistencies across teams. By properly </w:t>
+      </w:r>
+      <w:proofErr w:type="spellStart"/>
+      <w:r>
+        <w:t>dimensionalizing</w:t>
+      </w:r>
+      <w:proofErr w:type="spellEnd"/>
+      <w:r>
+        <w:t xml:space="preserve"> the data—using fact and dimension tables—the system improves query performance, simplifies logic, and ensures consistent metric definitions. This becomes critical as the platform scales.</w:t>
       </w:r>
     </w:p>
     <w:p>
       <w:r>
         <w:t xml:space="preserve">The proposed solution addresses these gaps by combining a Tableau-style dashboard with a structured, persistent commentary layer, delivered through a </w:t>
       </w:r>
+      <w:proofErr w:type="spellStart"/>
       <w:r>
         <w:rPr>
           <w:b/>
           <w:bCs/>
         </w:rPr>
-        <w:t>Streamlit-based application</w:t>
+        <w:t>Streamlit</w:t>
+      </w:r>
+      <w:proofErr w:type="spellEnd"/>
+      <w:r>
+        <w:rPr>
+          <w:b/>
+          <w:bCs/>
+        </w:rPr>
+        <w:t>-based application</w:t>
       </w:r>
       <w:r>
         <w:t>. Instead of separating charts from discussion, the platform embeds findings, risks, and actions directly within the dashboard experience. This ensures that both the data and the reasoning behind the data are stored together and remain accessible over time.</w:t>
@@ -287,7 +287,7 @@
     <w:p>
       <w:r>
         <w:pict w14:anchorId="51326B12">
-          <v:rect id="_x0000_i1136" style="width:0;height:1.5pt" o:hralign="center" o:hrstd="t" o:hr="t" fillcolor="#a0a0a0" stroked="f"/>
+          <v:rect id="_x0000_i1026" style="width:0;height:1.5pt" o:hralign="center" o:hrstd="t" o:hr="t" fillcolor="#a0a0a0" stroked="f"/>
         </w:pict>
       </w:r>
     </w:p>
@@ -310,12 +310,21 @@
       <w:r>
         <w:t xml:space="preserve">The solution is a </w:t>
       </w:r>
+      <w:proofErr w:type="spellStart"/>
       <w:r>
         <w:rPr>
           <w:b/>
           <w:bCs/>
         </w:rPr>
-        <w:t>Streamlit application</w:t>
+        <w:t>Streamlit</w:t>
+      </w:r>
+      <w:proofErr w:type="spellEnd"/>
+      <w:r>
+        <w:rPr>
+          <w:b/>
+          <w:bCs/>
+        </w:rPr>
+        <w:t xml:space="preserve"> application</w:t>
       </w:r>
       <w:r>
         <w:t xml:space="preserve"> that serves as the presentation layer for both analytics and decision tracking. It combines three core components:</w:t>
@@ -338,7 +347,15 @@
     </w:p>
     <w:p>
       <w:r>
-        <w:t>Users interact with dashboards similar to Tableau, including:</w:t>
+        <w:t xml:space="preserve">Users interact with dashboards </w:t>
+      </w:r>
+      <w:proofErr w:type="gramStart"/>
+      <w:r>
+        <w:t>similar to</w:t>
+      </w:r>
+      <w:proofErr w:type="gramEnd"/>
+      <w:r>
+        <w:t xml:space="preserve"> Tableau, including:</w:t>
       </w:r>
     </w:p>
     <w:p>
@@ -460,7 +477,6 @@
         </w:numPr>
       </w:pPr>
       <w:r>
-        <w:lastRenderedPageBreak/>
         <w:t>Entries are tagged as findings, risks, actions, or notes</w:t>
       </w:r>
     </w:p>
@@ -488,13 +504,14 @@
     </w:p>
     <w:p>
       <w:r>
+        <w:lastRenderedPageBreak/>
         <w:t>This replaces PowerPoint presentations and turns reporting into a continuous decision-making workflow.</w:t>
       </w:r>
     </w:p>
     <w:p>
       <w:r>
         <w:pict w14:anchorId="164276D9">
-          <v:rect id="_x0000_i1137" style="width:0;height:1.5pt" o:hralign="center" o:hrstd="t" o:hr="t" fillcolor="#a0a0a0" stroked="f"/>
+          <v:rect id="_x0000_i1027" style="width:0;height:1.5pt" o:hralign="center" o:hrstd="t" o:hr="t" fillcolor="#a0a0a0" stroked="f"/>
         </w:pict>
       </w:r>
     </w:p>
@@ -521,6 +538,9 @@
     <w:p/>
     <w:p>
       <w:r>
+        <w:rPr>
+          <w:noProof/>
+        </w:rPr>
         <w:drawing>
           <wp:inline distT="0" distB="0" distL="0" distR="0" wp14:anchorId="01D62B32" wp14:editId="34B30638">
             <wp:extent cx="5486400" cy="3016885"/>
@@ -591,7 +611,15 @@
         <w:t>ECS / Fargate</w:t>
       </w:r>
       <w:r>
-        <w:t xml:space="preserve"> → hosts Streamlit + APIs</w:t>
+        <w:t xml:space="preserve"> → hosts </w:t>
+      </w:r>
+      <w:proofErr w:type="spellStart"/>
+      <w:r>
+        <w:t>Streamlit</w:t>
+      </w:r>
+      <w:proofErr w:type="spellEnd"/>
+      <w:r>
+        <w:t xml:space="preserve"> + APIs</w:t>
       </w:r>
     </w:p>
     <w:p>
@@ -693,7 +721,15 @@
         </w:numPr>
       </w:pPr>
       <w:r>
-        <w:t>API layer serves data to Streamlit UI</w:t>
+        <w:t xml:space="preserve">API layer serves data to </w:t>
+      </w:r>
+      <w:proofErr w:type="spellStart"/>
+      <w:r>
+        <w:t>Streamlit</w:t>
+      </w:r>
+      <w:proofErr w:type="spellEnd"/>
+      <w:r>
+        <w:t xml:space="preserve"> UI</w:t>
       </w:r>
     </w:p>
     <w:p>
@@ -715,7 +751,7 @@
     <w:p>
       <w:r>
         <w:pict w14:anchorId="0ED61D21">
-          <v:rect id="_x0000_i1138" style="width:0;height:1.5pt" o:hralign="center" o:hrstd="t" o:hr="t" fillcolor="#a0a0a0" stroked="f"/>
+          <v:rect id="_x0000_i1028" style="width:0;height:1.5pt" o:hralign="center" o:hrstd="t" o:hr="t" fillcolor="#a0a0a0" stroked="f"/>
         </w:pict>
       </w:r>
     </w:p>
@@ -784,7 +820,6 @@
         </w:numPr>
       </w:pPr>
       <w:r>
-        <w:lastRenderedPageBreak/>
         <w:t>Faster query performance</w:t>
       </w:r>
     </w:p>
@@ -818,18 +853,27 @@
         </w:numPr>
       </w:pPr>
       <w:r>
+        <w:lastRenderedPageBreak/>
         <w:t>Reduced complexity in dashboard calculations</w:t>
       </w:r>
     </w:p>
     <w:p>
       <w:r>
-        <w:t>This directly improves dashboard responsiveness in the Streamlit application.</w:t>
+        <w:t xml:space="preserve">This directly improves dashboard responsiveness in the </w:t>
+      </w:r>
+      <w:proofErr w:type="spellStart"/>
+      <w:r>
+        <w:t>Streamlit</w:t>
+      </w:r>
+      <w:proofErr w:type="spellEnd"/>
+      <w:r>
+        <w:t xml:space="preserve"> application.</w:t>
       </w:r>
     </w:p>
     <w:p>
       <w:r>
         <w:pict w14:anchorId="47283A9A">
-          <v:rect id="_x0000_i1139" style="width:0;height:1.5pt" o:hralign="center" o:hrstd="t" o:hr="t" fillcolor="#a0a0a0" stroked="f"/>
+          <v:rect id="_x0000_i1029" style="width:0;height:1.5pt" o:hralign="center" o:hrstd="t" o:hr="t" fillcolor="#a0a0a0" stroked="f"/>
         </w:pict>
       </w:r>
     </w:p>
@@ -907,12 +951,21 @@
           <w:bCs/>
         </w:rPr>
       </w:pPr>
+      <w:proofErr w:type="spellStart"/>
       <w:r>
         <w:rPr>
           <w:b/>
           <w:bCs/>
         </w:rPr>
-        <w:t>Mid Scale (100 users)</w:t>
+        <w:t>Mid Scale</w:t>
+      </w:r>
+      <w:proofErr w:type="spellEnd"/>
+      <w:r>
+        <w:rPr>
+          <w:b/>
+          <w:bCs/>
+        </w:rPr>
+        <w:t xml:space="preserve"> (100 users)</w:t>
       </w:r>
     </w:p>
     <w:p>
@@ -977,7 +1030,7 @@
     <w:p>
       <w:r>
         <w:pict w14:anchorId="6D5D07F3">
-          <v:rect id="_x0000_i1140" style="width:0;height:1.5pt" o:hralign="center" o:hrstd="t" o:hr="t" fillcolor="#a0a0a0" stroked="f"/>
+          <v:rect id="_x0000_i1030" style="width:0;height:1.5pt" o:hralign="center" o:hrstd="t" o:hr="t" fillcolor="#a0a0a0" stroked="f"/>
         </w:pict>
       </w:r>
     </w:p>
@@ -1054,7 +1107,7 @@
     <w:p>
       <w:r>
         <w:pict w14:anchorId="2506E599">
-          <v:rect id="_x0000_i1141" style="width:0;height:1.5pt" o:hralign="center" o:hrstd="t" o:hr="t" fillcolor="#a0a0a0" stroked="f"/>
+          <v:rect id="_x0000_i1031" style="width:0;height:1.5pt" o:hralign="center" o:hrstd="t" o:hr="t" fillcolor="#a0a0a0" stroked="f"/>
         </w:pict>
       </w:r>
     </w:p>
@@ -1152,7 +1205,7 @@
     <w:p>
       <w:r>
         <w:pict w14:anchorId="14A2DCDA">
-          <v:rect id="_x0000_i1142" style="width:0;height:1.5pt" o:hralign="center" o:hrstd="t" o:hr="t" fillcolor="#a0a0a0" stroked="f"/>
+          <v:rect id="_x0000_i1032" style="width:0;height:1.5pt" o:hralign="center" o:hrstd="t" o:hr="t" fillcolor="#a0a0a0" stroked="f"/>
         </w:pict>
       </w:r>
     </w:p>
@@ -1281,9 +1334,8 @@
     </w:p>
     <w:p>
       <w:r>
-        <w:lastRenderedPageBreak/>
         <w:pict w14:anchorId="46FF487F">
-          <v:rect id="_x0000_i1143" style="width:0;height:1.5pt" o:hralign="center" o:hrstd="t" o:hr="t" fillcolor="#a0a0a0" stroked="f"/>
+          <v:rect id="_x0000_i1033" style="width:0;height:1.5pt" o:hralign="center" o:hrstd="t" o:hr="t" fillcolor="#a0a0a0" stroked="f"/>
         </w:pict>
       </w:r>
     </w:p>
@@ -1315,6 +1367,7 @@
     </w:p>
     <w:p>
       <w:r>
+        <w:lastRenderedPageBreak/>
         <w:t>Annual cost:</w:t>
       </w:r>
     </w:p>
@@ -1332,7 +1385,7 @@
     <w:p>
       <w:r>
         <w:pict w14:anchorId="4A8D1DE8">
-          <v:rect id="_x0000_i1144" style="width:0;height:1.5pt" o:hralign="center" o:hrstd="t" o:hr="t" fillcolor="#a0a0a0" stroked="f"/>
+          <v:rect id="_x0000_i1034" style="width:0;height:1.5pt" o:hralign="center" o:hrstd="t" o:hr="t" fillcolor="#a0a0a0" stroked="f"/>
         </w:pict>
       </w:r>
     </w:p>
@@ -1470,7 +1523,15 @@
         </w:numPr>
       </w:pPr>
       <w:r>
-        <w:t>Auto-scaling compute (ECS/Fargate)</w:t>
+        <w:t xml:space="preserve">Auto-scaling </w:t>
+      </w:r>
+      <w:proofErr w:type="gramStart"/>
+      <w:r>
+        <w:t>compute</w:t>
+      </w:r>
+      <w:proofErr w:type="gramEnd"/>
+      <w:r>
+        <w:t xml:space="preserve"> (ECS/Fargate)</w:t>
       </w:r>
     </w:p>
     <w:p>
@@ -1498,7 +1559,7 @@
     <w:p>
       <w:r>
         <w:pict w14:anchorId="22C12B18">
-          <v:rect id="_x0000_i1145" style="width:0;height:1.5pt" o:hralign="center" o:hrstd="t" o:hr="t" fillcolor="#a0a0a0" stroked="f"/>
+          <v:rect id="_x0000_i1035" style="width:0;height:1.5pt" o:hralign="center" o:hrstd="t" o:hr="t" fillcolor="#a0a0a0" stroked="f"/>
         </w:pict>
       </w:r>
     </w:p>
@@ -1547,7 +1608,15 @@
         </w:numPr>
       </w:pPr>
       <w:r>
-        <w:t>Frontend Development (Streamlit, UX)</w:t>
+        <w:t>Frontend Development (</w:t>
+      </w:r>
+      <w:proofErr w:type="spellStart"/>
+      <w:r>
+        <w:t>Streamlit</w:t>
+      </w:r>
+      <w:proofErr w:type="spellEnd"/>
+      <w:r>
+        <w:t>, UX)</w:t>
       </w:r>
     </w:p>
     <w:p>
@@ -1580,7 +1649,7 @@
     <w:p>
       <w:r>
         <w:pict w14:anchorId="679EFB14">
-          <v:rect id="_x0000_i1146" style="width:0;height:1.5pt" o:hralign="center" o:hrstd="t" o:hr="t" fillcolor="#a0a0a0" stroked="f"/>
+          <v:rect id="_x0000_i1036" style="width:0;height:1.5pt" o:hralign="center" o:hrstd="t" o:hr="t" fillcolor="#a0a0a0" stroked="f"/>
         </w:pict>
       </w:r>
     </w:p>
@@ -1694,7 +1763,7 @@
     <w:p>
       <w:r>
         <w:pict w14:anchorId="5913136B">
-          <v:rect id="_x0000_i1147" style="width:0;height:1.5pt" o:hralign="center" o:hrstd="t" o:hr="t" fillcolor="#a0a0a0" stroked="f"/>
+          <v:rect id="_x0000_i1037" style="width:0;height:1.5pt" o:hralign="center" o:hrstd="t" o:hr="t" fillcolor="#a0a0a0" stroked="f"/>
         </w:pict>
       </w:r>
     </w:p>
@@ -1776,7 +1845,7 @@
     <w:p>
       <w:r>
         <w:pict w14:anchorId="4BDCD1F4">
-          <v:rect id="_x0000_i1148" style="width:0;height:1.5pt" o:hralign="center" o:hrstd="t" o:hr="t" fillcolor="#a0a0a0" stroked="f"/>
+          <v:rect id="_x0000_i1038" style="width:0;height:1.5pt" o:hralign="center" o:hrstd="t" o:hr="t" fillcolor="#a0a0a0" stroked="f"/>
         </w:pict>
       </w:r>
     </w:p>
@@ -1792,18 +1861,34 @@
           <w:b/>
           <w:bCs/>
         </w:rPr>
+        <w:t>Conclusion</w:t>
+      </w:r>
+    </w:p>
+    <w:p>
+      <w:r>
         <w:lastRenderedPageBreak/>
-        <w:t>Conclusion</w:t>
-      </w:r>
-    </w:p>
-    <w:p>
-      <w:r>
-        <w:t>This solution transforms dashboards from static reporting tools into active decision-making systems. By combining a Streamlit-based interface, scalable cloud architecture, and dimensional data modeling, it bridges the gap between data and business decisions.</w:t>
-      </w:r>
-    </w:p>
-    <w:p>
-      <w:r>
-        <w:t>While it requires real engineering investment—including infrastructure, CI/CD, and a dedicated development team—the payoff is significant. It reduces manual reporting effort, improves alignment, and creates a long-term system of institutional memory.</w:t>
+        <w:t xml:space="preserve">This solution transforms dashboards from static reporting tools into active decision-making systems. By combining a </w:t>
+      </w:r>
+      <w:proofErr w:type="spellStart"/>
+      <w:r>
+        <w:t>Streamlit</w:t>
+      </w:r>
+      <w:proofErr w:type="spellEnd"/>
+      <w:r>
+        <w:t>-based interface, scalable cloud architecture, and dimensional data modeling, it bridges the gap between data and business decisions.</w:t>
+      </w:r>
+    </w:p>
+    <w:p>
+      <w:r>
+        <w:t xml:space="preserve">While it requires real engineering investment—including infrastructure, CI/CD, and a dedicated development </w:t>
+      </w:r>
+      <w:proofErr w:type="gramStart"/>
+      <w:r>
+        <w:t>team—</w:t>
+      </w:r>
+      <w:proofErr w:type="gramEnd"/>
+      <w:r>
+        <w:t>the payoff is significant. It reduces manual reporting effort, improves alignment, and creates a long-term system of institutional memory.</w:t>
       </w:r>
     </w:p>
     <w:p>
@@ -1814,23 +1899,8 @@
     <w:p>
       <w:r>
         <w:pict w14:anchorId="716F4E8F">
-          <v:rect id="_x0000_i1149" style="width:0;height:1.5pt" o:hralign="center" o:hrstd="t" o:hr="t" fillcolor="#a0a0a0" stroked="f"/>
+          <v:rect id="_x0000_i1039" style="width:0;height:1.5pt" o:hralign="center" o:hrstd="t" o:hr="t" fillcolor="#a0a0a0" stroked="f"/>
         </w:pict>
-      </w:r>
-    </w:p>
-    <w:p>
-      <w:r>
-        <w:t xml:space="preserve">If you want next step: I can turn that architecture diagram into a </w:t>
-      </w:r>
-      <w:r>
-        <w:rPr>
-          <w:b/>
-          <w:bCs/>
-        </w:rPr>
-        <w:t>clean visual (PowerPoint-ready diagram)</w:t>
-      </w:r>
-      <w:r>
-        <w:t>—that would take this to another level.</w:t>
       </w:r>
     </w:p>
     <w:p/>
@@ -9014,6 +9084,7 @@
   <w:style w:type="character" w:default="1" w:styleId="DefaultParagraphFont">
     <w:name w:val="Default Paragraph Font"/>
     <w:uiPriority w:val="1"/>
+    <w:semiHidden/>
     <w:unhideWhenUsed/>
   </w:style>
   <w:style w:type="table" w:default="1" w:styleId="TableNormal">

</xml_diff>